<commit_message>
Update repository URLs with Michibel username
</commit_message>
<xml_diff>
--- a/Entrega_Proyecto_Copilot.docx
+++ b/Entrega_Proyecto_Copilot.docx
@@ -49,7 +49,6 @@
             <w:r>
               <w:rPr>
                 <w:b/>
-                <w:sz w:val="22"/>
               </w:rPr>
               <w:t>Estudiante:</w:t>
             </w:r>
@@ -61,9 +60,6 @@
           </w:tcPr>
           <w:p>
             <w:r>
-              <w:rPr>
-                <w:sz w:val="22"/>
-              </w:rPr>
               <w:t>Gabriel</w:t>
             </w:r>
           </w:p>
@@ -78,7 +74,31 @@
             <w:r>
               <w:rPr>
                 <w:b/>
-                <w:sz w:val="22"/>
+              </w:rPr>
+              <w:t>Usuario GitHub:</w:t>
+            </w:r>
+          </w:p>
+        </w:tc>
+        <w:tc>
+          <w:tcPr>
+            <w:tcW w:type="dxa" w:w="4680"/>
+          </w:tcPr>
+          <w:p>
+            <w:r>
+              <w:t>Michibel</w:t>
+            </w:r>
+          </w:p>
+        </w:tc>
+      </w:tr>
+      <w:tr>
+        <w:tc>
+          <w:tcPr>
+            <w:tcW w:type="dxa" w:w="4680"/>
+          </w:tcPr>
+          <w:p>
+            <w:r>
+              <w:rPr>
+                <w:b/>
               </w:rPr>
               <w:t>Correo Electrónico:</w:t>
             </w:r>
@@ -90,9 +110,6 @@
           </w:tcPr>
           <w:p>
             <w:r>
-              <w:rPr>
-                <w:sz w:val="22"/>
-              </w:rPr>
               <w:t>genshincuenta316@gmail.com</w:t>
             </w:r>
           </w:p>
@@ -107,7 +124,6 @@
             <w:r>
               <w:rPr>
                 <w:b/>
-                <w:sz w:val="22"/>
               </w:rPr>
               <w:t>Asignatura:</w:t>
             </w:r>
@@ -119,9 +135,6 @@
           </w:tcPr>
           <w:p>
             <w:r>
-              <w:rPr>
-                <w:sz w:val="22"/>
-              </w:rPr>
               <w:t>Tendencias Emergentes en Inteligencia Artificial</w:t>
             </w:r>
           </w:p>
@@ -136,7 +149,6 @@
             <w:r>
               <w:rPr>
                 <w:b/>
-                <w:sz w:val="22"/>
               </w:rPr>
               <w:t>Institución:</w:t>
             </w:r>
@@ -148,39 +160,7 @@
           </w:tcPr>
           <w:p>
             <w:r>
-              <w:rPr>
-                <w:sz w:val="22"/>
-              </w:rPr>
               <w:t>INACAP</w:t>
-            </w:r>
-          </w:p>
-        </w:tc>
-      </w:tr>
-      <w:tr>
-        <w:tc>
-          <w:tcPr>
-            <w:tcW w:type="dxa" w:w="4680"/>
-          </w:tcPr>
-          <w:p>
-            <w:r>
-              <w:rPr>
-                <w:b/>
-                <w:sz w:val="22"/>
-              </w:rPr>
-              <w:t>Fecha:</w:t>
-            </w:r>
-          </w:p>
-        </w:tc>
-        <w:tc>
-          <w:tcPr>
-            <w:tcW w:type="dxa" w:w="4680"/>
-          </w:tcPr>
-          <w:p>
-            <w:r>
-              <w:rPr>
-                <w:sz w:val="22"/>
-              </w:rPr>
-              <w:t>Octubre 2026</w:t>
             </w:r>
           </w:p>
         </w:tc>
@@ -194,7 +174,6 @@
       <w:r>
         <w:rPr>
           <w:b/>
-          <w:sz w:val="28"/>
         </w:rPr>
         <w:t>1. Enlace del Repositorio de la Actividad</w:t>
       </w:r>
@@ -211,17 +190,7 @@
           <w:color w:val="0066CC"/>
           <w:u w:val="single"/>
         </w:rPr>
-        <w:t>https://github.com/Gabriel/AI_Project</w:t>
-      </w:r>
-    </w:p>
-    <w:p>
-      <w:r>
-        <w:rPr>
-          <w:i/>
-          <w:color w:val="787878"/>
-          <w:sz w:val="19"/>
-        </w:rPr>
-        <w:t>(Nota: Asegúrese de sustituir el nombre de usuario por su cuenta final de GitHub si difiere de la actual antes de entregar en el AAI).</w:t>
+        <w:t>https://github.com/Michibel/AI_Project</w:t>
       </w:r>
     </w:p>
     <w:p>
@@ -231,7 +200,6 @@
       <w:r>
         <w:rPr>
           <w:b/>
-          <w:sz w:val="28"/>
         </w:rPr>
         <w:t>2. Resumen de Actividades Realizadas</w:t>
       </w:r>
@@ -241,9 +209,6 @@
         <w:pStyle w:val="ListBullet"/>
       </w:pPr>
       <w:r>
-        <w:rPr>
-          <w:sz w:val="21"/>
-        </w:rPr>
         <w:t>Solicitud y activación de cuenta de estudiante en GitHub Copilot y configuración del entorno en Visual Studio Code.</w:t>
       </w:r>
     </w:p>
@@ -252,10 +217,7 @@
         <w:pStyle w:val="ListBullet"/>
       </w:pPr>
       <w:r>
-        <w:rPr>
-          <w:sz w:val="21"/>
-        </w:rPr>
-        <w:t>Creación del repositorio 'AI_Project' con inicialización de README y .gitignore.</w:t>
+        <w:t>Creación del repositorio AI_Project con inicialización de README y .gitignore.</w:t>
       </w:r>
     </w:p>
     <w:p>
@@ -263,9 +225,6 @@
         <w:pStyle w:val="ListBullet"/>
       </w:pPr>
       <w:r>
-        <w:rPr>
-          <w:sz w:val="21"/>
-        </w:rPr>
         <w:t>Clonación local e integración en Visual Studio Code.</w:t>
       </w:r>
     </w:p>
@@ -274,9 +233,6 @@
         <w:pStyle w:val="ListBullet"/>
       </w:pPr>
       <w:r>
-        <w:rPr>
-          <w:sz w:val="21"/>
-        </w:rPr>
         <w:t>Generación asistida mediante GitHub Copilot del sistema de recomendación basado en Machine Learning (recommendation_system.py).</w:t>
       </w:r>
     </w:p>
@@ -285,10 +241,7 @@
         <w:pStyle w:val="ListBullet"/>
       </w:pPr>
       <w:r>
-        <w:rPr>
-          <w:sz w:val="21"/>
-        </w:rPr>
-        <w:t>Construcción del conjunto de datos 'products.csv' para el entrenamiento y prueba del algoritmo KNeighborsClassifier.</w:t>
+        <w:t>Construcción del conjunto de datos products.csv para el entrenamiento y prueba del algoritmo KNeighborsClassifier.</w:t>
       </w:r>
     </w:p>
     <w:p>
@@ -296,9 +249,6 @@
         <w:pStyle w:val="ListBullet"/>
       </w:pPr>
       <w:r>
-        <w:rPr>
-          <w:sz w:val="21"/>
-        </w:rPr>
         <w:t>Validación y ejecución del modelo obteniendo un Accuracy del 100% y predicciones de recomendación exitosas.</w:t>
       </w:r>
     </w:p>
@@ -307,9 +257,6 @@
         <w:pStyle w:val="ListBullet"/>
       </w:pPr>
       <w:r>
-        <w:rPr>
-          <w:sz w:val="21"/>
-        </w:rPr>
         <w:t>Documentación completa del flujo técnico en el archivo README.md.</w:t>
       </w:r>
     </w:p>
@@ -318,10 +265,7 @@
         <w:pStyle w:val="ListBullet"/>
       </w:pPr>
       <w:r>
-        <w:rPr>
-          <w:sz w:val="21"/>
-        </w:rPr>
-        <w:t>Control de versiones mediante Git (add, commit con mensaje 'Add recommendation system example' y preparación para push remoto).</w:t>
+        <w:t>Control de versiones mediante Git y sincronización con GitHub remoto.</w:t>
       </w:r>
     </w:p>
     <w:sectPr>

</xml_diff>

<commit_message>
Update students to Gabriel Martel and Vicente Elgueta and delivery date to Oct 20
</commit_message>
<xml_diff>
--- a/Entrega_Proyecto_Copilot.docx
+++ b/Entrega_Proyecto_Copilot.docx
@@ -50,7 +50,7 @@
               <w:rPr>
                 <w:b/>
               </w:rPr>
-              <w:t>Estudiante:</w:t>
+              <w:t>Estudiantes:</w:t>
             </w:r>
           </w:p>
         </w:tc>
@@ -60,7 +60,7 @@
           </w:tcPr>
           <w:p>
             <w:r>
-              <w:t>Gabriel</w:t>
+              <w:t>Gabriel Martel, Vicente Elgueta</w:t>
             </w:r>
           </w:p>
         </w:tc>
@@ -161,6 +161,31 @@
           <w:p>
             <w:r>
               <w:t>INACAP</w:t>
+            </w:r>
+          </w:p>
+        </w:tc>
+      </w:tr>
+      <w:tr>
+        <w:tc>
+          <w:tcPr>
+            <w:tcW w:type="dxa" w:w="4680"/>
+          </w:tcPr>
+          <w:p>
+            <w:r>
+              <w:rPr>
+                <w:b/>
+              </w:rPr>
+              <w:t>Fecha de Entrega:</w:t>
+            </w:r>
+          </w:p>
+        </w:tc>
+        <w:tc>
+          <w:tcPr>
+            <w:tcW w:type="dxa" w:w="4680"/>
+          </w:tcPr>
+          <w:p>
+            <w:r>
+              <w:t>20 de Octubre de 2026</w:t>
             </w:r>
           </w:p>
         </w:tc>

</xml_diff>